<commit_message>
Reorganizar reporte por características y evidencias
</commit_message>
<xml_diff>
--- a/08-aplicacion-web-maquetada-ecoruta/docs/api-cache/Reporte_Subproducto_04_API_Cache_Kevin_Salas_Jimarez.docx
+++ b/08-aplicacion-web-maquetada-ecoruta/docs/api-cache/Reporte_Subproducto_04_API_Cache_Kevin_Salas_Jimarez.docx
@@ -504,7 +504,7 @@
           <w:color w:val="000000"/>
           <w:sz w:val="22"/>
         </w:rPr>
-        <w:t>5 Diagnóstico de EcoRuta</w:t>
+        <w:t>5 Características y diagnóstico de EcoRuta</w:t>
         <w:tab/>
         <w:t>6</w:t>
       </w:r>
@@ -522,7 +522,7 @@
           <w:color w:val="000000"/>
           <w:sz w:val="22"/>
         </w:rPr>
-        <w:t>6 Nuevas implementaciones en EcoRuta</w:t>
+        <w:t>6 Evidencias por característica</w:t>
         <w:tab/>
         <w:t>8</w:t>
       </w:r>
@@ -1230,7 +1230,21 @@
           <w:b/>
           <w:color w:val="000000"/>
         </w:rPr>
-        <w:t>3.2 Diferencia entre caché HTTP y API Cache</w:t>
+        <w:t>3.2 Tipos de caché y estrategias utilizadas</w:t>
+      </w:r>
+    </w:p>
+    <w:p>
+      <w:pPr>
+        <w:spacing w:after="140" w:line="269" w:lineRule="auto"/>
+        <w:jc w:val="both"/>
+      </w:pPr>
+      <w:r>
+        <w:rPr>
+          <w:rFonts w:ascii="Arial" w:hAnsi="Arial"/>
+          <w:color w:val="000000"/>
+          <w:sz w:val="21"/>
+        </w:rPr>
+        <w:t>La caché HTTP depende principalmente de las cabeceras y decisiones del navegador. La API Cache, en cambio, permite que el Service Worker seleccione recursos, estrategias y reglas de limpieza. EcoRuta utiliza los siguientes tipos funcionales:</w:t>
       </w:r>
     </w:p>
     <w:tbl>
@@ -1258,7 +1272,7 @@
         </w:trPr>
         <w:tc>
           <w:tcPr>
-            <w:tcW w:type="dxa" w:w="1584"/>
+            <w:tcW w:type="dxa" w:w="1944"/>
             <w:vAlign w:val="center"/>
             <w:shd w:fill="0D3B2E"/>
           </w:tcPr>
@@ -1275,13 +1289,13 @@
                 <w:color w:val="FFFFFF"/>
                 <w:sz w:val="18"/>
               </w:rPr>
-              <w:t>Aspecto</w:t>
-            </w:r>
-          </w:p>
-        </w:tc>
-        <w:tc>
-          <w:tcPr>
-            <w:tcW w:type="dxa" w:w="3528"/>
+              <w:t>Tipo o estrategia</w:t>
+            </w:r>
+          </w:p>
+        </w:tc>
+        <w:tc>
+          <w:tcPr>
+            <w:tcW w:type="dxa" w:w="3384"/>
             <w:vAlign w:val="center"/>
             <w:shd w:fill="0D3B2E"/>
           </w:tcPr>
@@ -1298,13 +1312,13 @@
                 <w:color w:val="FFFFFF"/>
                 <w:sz w:val="18"/>
               </w:rPr>
-              <w:t>Caché HTTP del navegador</w:t>
-            </w:r>
-          </w:p>
-        </w:tc>
-        <w:tc>
-          <w:tcPr>
-            <w:tcW w:type="dxa" w:w="3528"/>
+              <w:t>Qué almacena o prioriza</w:t>
+            </w:r>
+          </w:p>
+        </w:tc>
+        <w:tc>
+          <w:tcPr>
+            <w:tcW w:type="dxa" w:w="3312"/>
             <w:vAlign w:val="center"/>
             <w:shd w:fill="0D3B2E"/>
           </w:tcPr>
@@ -1321,7 +1335,7 @@
                 <w:color w:val="FFFFFF"/>
                 <w:sz w:val="18"/>
               </w:rPr>
-              <w:t>API Cache de la PWA</w:t>
+              <w:t>Uso en EcoRuta</w:t>
             </w:r>
           </w:p>
         </w:tc>
@@ -1329,7 +1343,7 @@
       <w:tr>
         <w:tc>
           <w:tcPr>
-            <w:tcW w:type="dxa" w:w="1584"/>
+            <w:tcW w:type="dxa" w:w="1944"/>
             <w:vAlign w:val="center"/>
             <w:shd w:fill="FFFFFF"/>
           </w:tcPr>
@@ -1346,13 +1360,13 @@
                 <w:color w:val="000000"/>
                 <w:sz w:val="17"/>
               </w:rPr>
-              <w:t>Control</w:t>
-            </w:r>
-          </w:p>
-        </w:tc>
-        <w:tc>
-          <w:tcPr>
-            <w:tcW w:type="dxa" w:w="3528"/>
+              <w:t>Caché del shell</w:t>
+            </w:r>
+          </w:p>
+        </w:tc>
+        <w:tc>
+          <w:tcPr>
+            <w:tcW w:type="dxa" w:w="3384"/>
             <w:vAlign w:val="center"/>
             <w:shd w:fill="FFFFFF"/>
           </w:tcPr>
@@ -1369,13 +1383,13 @@
                 <w:color w:val="000000"/>
                 <w:sz w:val="17"/>
               </w:rPr>
-              <w:t>Depende de cabeceras como Cache-Control y del navegador.</w:t>
-            </w:r>
-          </w:p>
-        </w:tc>
-        <w:tc>
-          <w:tcPr>
-            <w:tcW w:type="dxa" w:w="3528"/>
+              <w:t>Archivos indispensables de la interfaz.</w:t>
+            </w:r>
+          </w:p>
+        </w:tc>
+        <w:tc>
+          <w:tcPr>
+            <w:tcW w:type="dxa" w:w="3312"/>
             <w:vAlign w:val="center"/>
             <w:shd w:fill="FFFFFF"/>
           </w:tcPr>
@@ -1392,7 +1406,7 @@
                 <w:color w:val="000000"/>
                 <w:sz w:val="17"/>
               </w:rPr>
-              <w:t>La controla JavaScript desde el Service Worker.</w:t>
+              <w:t>HTML, CSS, JavaScript, manifest, iconos e imágenes.</w:t>
             </w:r>
           </w:p>
         </w:tc>
@@ -1400,7 +1414,7 @@
       <w:tr>
         <w:tc>
           <w:tcPr>
-            <w:tcW w:type="dxa" w:w="1584"/>
+            <w:tcW w:type="dxa" w:w="1944"/>
             <w:vAlign w:val="center"/>
             <w:shd w:fill="F2F4F3"/>
           </w:tcPr>
@@ -1417,13 +1431,13 @@
                 <w:color w:val="000000"/>
                 <w:sz w:val="17"/>
               </w:rPr>
-              <w:t>Contenido</w:t>
-            </w:r>
-          </w:p>
-        </w:tc>
-        <w:tc>
-          <w:tcPr>
-            <w:tcW w:type="dxa" w:w="3528"/>
+              <w:t>Caché dinámica</w:t>
+            </w:r>
+          </w:p>
+        </w:tc>
+        <w:tc>
+          <w:tcPr>
+            <w:tcW w:type="dxa" w:w="3384"/>
             <w:vAlign w:val="center"/>
             <w:shd w:fill="F2F4F3"/>
           </w:tcPr>
@@ -1440,13 +1454,13 @@
                 <w:color w:val="000000"/>
                 <w:sz w:val="17"/>
               </w:rPr>
-              <w:t>Almacena respuestas conforme a políticas HTTP.</w:t>
-            </w:r>
-          </w:p>
-        </w:tc>
-        <w:tc>
-          <w:tcPr>
-            <w:tcW w:type="dxa" w:w="3528"/>
+              <w:t>Recursos descubiertos durante la navegación.</w:t>
+            </w:r>
+          </w:p>
+        </w:tc>
+        <w:tc>
+          <w:tcPr>
+            <w:tcW w:type="dxa" w:w="3312"/>
             <w:vAlign w:val="center"/>
             <w:shd w:fill="F2F4F3"/>
           </w:tcPr>
@@ -1463,7 +1477,7 @@
                 <w:color w:val="000000"/>
                 <w:sz w:val="17"/>
               </w:rPr>
-              <w:t>Guarda pares Request/Response seleccionados por la aplicación.</w:t>
+              <w:t>Respuestas válidas almacenadas en runtime-v2.</w:t>
             </w:r>
           </w:p>
         </w:tc>
@@ -1471,7 +1485,7 @@
       <w:tr>
         <w:tc>
           <w:tcPr>
-            <w:tcW w:type="dxa" w:w="1584"/>
+            <w:tcW w:type="dxa" w:w="1944"/>
             <w:vAlign w:val="center"/>
             <w:shd w:fill="FFFFFF"/>
           </w:tcPr>
@@ -1488,13 +1502,13 @@
                 <w:color w:val="000000"/>
                 <w:sz w:val="17"/>
               </w:rPr>
-              <w:t>Estrategia</w:t>
-            </w:r>
-          </w:p>
-        </w:tc>
-        <w:tc>
-          <w:tcPr>
-            <w:tcW w:type="dxa" w:w="3528"/>
+              <w:t>Precaché</w:t>
+            </w:r>
+          </w:p>
+        </w:tc>
+        <w:tc>
+          <w:tcPr>
+            <w:tcW w:type="dxa" w:w="3384"/>
             <w:vAlign w:val="center"/>
             <w:shd w:fill="FFFFFF"/>
           </w:tcPr>
@@ -1511,13 +1525,13 @@
                 <w:color w:val="000000"/>
                 <w:sz w:val="17"/>
               </w:rPr>
-              <w:t>No define una lógica completa de uso offline.</w:t>
-            </w:r>
-          </w:p>
-        </w:tc>
-        <w:tc>
-          <w:tcPr>
-            <w:tcW w:type="dxa" w:w="3528"/>
+              <w:t>Recursos definidos antes de navegar.</w:t>
+            </w:r>
+          </w:p>
+        </w:tc>
+        <w:tc>
+          <w:tcPr>
+            <w:tcW w:type="dxa" w:w="3312"/>
             <w:vAlign w:val="center"/>
             <w:shd w:fill="FFFFFF"/>
           </w:tcPr>
@@ -1534,7 +1548,7 @@
                 <w:color w:val="000000"/>
                 <w:sz w:val="17"/>
               </w:rPr>
-              <w:t>Permite Cache First, Network First y otras estrategias.</w:t>
+              <w:t>Se ejecuta durante install con add() y addAll().</w:t>
             </w:r>
           </w:p>
         </w:tc>
@@ -1542,7 +1556,7 @@
       <w:tr>
         <w:tc>
           <w:tcPr>
-            <w:tcW w:type="dxa" w:w="1584"/>
+            <w:tcW w:type="dxa" w:w="1944"/>
             <w:vAlign w:val="center"/>
             <w:shd w:fill="F2F4F3"/>
           </w:tcPr>
@@ -1559,13 +1573,13 @@
                 <w:color w:val="000000"/>
                 <w:sz w:val="17"/>
               </w:rPr>
-              <w:t>Limpieza</w:t>
-            </w:r>
-          </w:p>
-        </w:tc>
-        <w:tc>
-          <w:tcPr>
-            <w:tcW w:type="dxa" w:w="3528"/>
+              <w:t>Cache First</w:t>
+            </w:r>
+          </w:p>
+        </w:tc>
+        <w:tc>
+          <w:tcPr>
+            <w:tcW w:type="dxa" w:w="3384"/>
             <w:vAlign w:val="center"/>
             <w:shd w:fill="F2F4F3"/>
           </w:tcPr>
@@ -1582,13 +1596,13 @@
                 <w:color w:val="000000"/>
                 <w:sz w:val="17"/>
               </w:rPr>
-              <w:t>La administra principalmente el navegador.</w:t>
-            </w:r>
-          </w:p>
-        </w:tc>
-        <w:tc>
-          <w:tcPr>
-            <w:tcW w:type="dxa" w:w="3528"/>
+              <w:t>Prioriza la copia local y después la red.</w:t>
+            </w:r>
+          </w:p>
+        </w:tc>
+        <w:tc>
+          <w:tcPr>
+            <w:tcW w:type="dxa" w:w="3312"/>
             <w:vAlign w:val="center"/>
             <w:shd w:fill="F2F4F3"/>
           </w:tcPr>
@@ -1605,7 +1619,78 @@
                 <w:color w:val="000000"/>
                 <w:sz w:val="17"/>
               </w:rPr>
-              <w:t>La aplicación enumera y elimina cachés o entradas.</w:t>
+              <w:t>Estilos, scripts, imágenes y fuentes.</w:t>
+            </w:r>
+          </w:p>
+        </w:tc>
+      </w:tr>
+      <w:tr>
+        <w:tc>
+          <w:tcPr>
+            <w:tcW w:type="dxa" w:w="1944"/>
+            <w:vAlign w:val="center"/>
+            <w:shd w:fill="FFFFFF"/>
+          </w:tcPr>
+          <w:p>
+            <w:pPr>
+              <w:spacing w:after="0" w:line="240" w:lineRule="auto"/>
+              <w:jc w:val="left"/>
+            </w:pPr>
+            <w:r/>
+            <w:r>
+              <w:rPr>
+                <w:rFonts w:ascii="Arial" w:hAnsi="Arial"/>
+                <w:b w:val="0"/>
+                <w:color w:val="000000"/>
+                <w:sz w:val="17"/>
+              </w:rPr>
+              <w:t>Network First</w:t>
+            </w:r>
+          </w:p>
+        </w:tc>
+        <w:tc>
+          <w:tcPr>
+            <w:tcW w:type="dxa" w:w="3384"/>
+            <w:vAlign w:val="center"/>
+            <w:shd w:fill="FFFFFF"/>
+          </w:tcPr>
+          <w:p>
+            <w:pPr>
+              <w:spacing w:after="0" w:line="240" w:lineRule="auto"/>
+              <w:jc w:val="left"/>
+            </w:pPr>
+            <w:r/>
+            <w:r>
+              <w:rPr>
+                <w:rFonts w:ascii="Arial" w:hAnsi="Arial"/>
+                <w:b w:val="0"/>
+                <w:color w:val="000000"/>
+                <w:sz w:val="17"/>
+              </w:rPr>
+              <w:t>Prioriza información actual de red y usa respaldo local.</w:t>
+            </w:r>
+          </w:p>
+        </w:tc>
+        <w:tc>
+          <w:tcPr>
+            <w:tcW w:type="dxa" w:w="3312"/>
+            <w:vAlign w:val="center"/>
+            <w:shd w:fill="FFFFFF"/>
+          </w:tcPr>
+          <w:p>
+            <w:pPr>
+              <w:spacing w:after="0" w:line="240" w:lineRule="auto"/>
+              <w:jc w:val="left"/>
+            </w:pPr>
+            <w:r/>
+            <w:r>
+              <w:rPr>
+                <w:rFonts w:ascii="Arial" w:hAnsi="Arial"/>
+                <w:b w:val="0"/>
+                <w:color w:val="000000"/>
+                <w:sz w:val="17"/>
+              </w:rPr>
+              <w:t>Documentos HTML y pantalla offline.</w:t>
             </w:r>
           </w:p>
         </w:tc>
@@ -3187,86 +3272,547 @@
           <w:b/>
           <w:color w:val="000000"/>
         </w:rPr>
-        <w:t>5.2 Características verificadas</w:t>
-      </w:r>
-    </w:p>
-    <w:p>
-      <w:pPr>
-        <w:spacing w:after="60"/>
-        <w:ind w:left="360" w:hanging="259"/>
-      </w:pPr>
-      <w:r>
-        <w:rPr>
-          <w:rFonts w:ascii="Arial" w:hAnsi="Arial"/>
+        <w:t>5.2 Características de la API Cache implementadas</w:t>
+      </w:r>
+    </w:p>
+    <w:p>
+      <w:pPr>
+        <w:spacing w:after="140" w:line="269" w:lineRule="auto"/>
+        <w:jc w:val="both"/>
+      </w:pPr>
+      <w:r>
+        <w:rPr>
+          <w:rFonts w:ascii="Arial" w:hAnsi="Arial"/>
+          <w:color w:val="000000"/>
           <w:sz w:val="21"/>
         </w:rPr>
-        <w:t>•  C1. Dos cachés versionadas: shell y runtime.</w:t>
-      </w:r>
-    </w:p>
-    <w:p>
-      <w:pPr>
-        <w:spacing w:after="60"/>
-        <w:ind w:left="360" w:hanging="259"/>
-      </w:pPr>
-      <w:r>
-        <w:rPr>
-          <w:rFonts w:ascii="Arial" w:hAnsi="Arial"/>
-          <w:sz w:val="21"/>
-        </w:rPr>
-        <w:t>•  C2. Precaché individual y múltiple con add() y addAll().</w:t>
-      </w:r>
-    </w:p>
-    <w:p>
-      <w:pPr>
-        <w:spacing w:after="60"/>
-        <w:ind w:left="360" w:hanging="259"/>
-      </w:pPr>
-      <w:r>
-        <w:rPr>
-          <w:rFonts w:ascii="Arial" w:hAnsi="Arial"/>
-          <w:sz w:val="21"/>
-        </w:rPr>
-        <w:t>•  C3. Límite de 40 entradas dinámicas mediante keys() y delete().</w:t>
-      </w:r>
-    </w:p>
-    <w:p>
-      <w:pPr>
-        <w:spacing w:after="60"/>
-        <w:ind w:left="360" w:hanging="259"/>
-      </w:pPr>
-      <w:r>
-        <w:rPr>
-          <w:rFonts w:ascii="Arial" w:hAnsi="Arial"/>
-          <w:sz w:val="21"/>
-        </w:rPr>
-        <w:t>•  C4. Estrategias diferenciadas Network First y Cache First.</w:t>
-      </w:r>
-    </w:p>
-    <w:p>
-      <w:pPr>
-        <w:spacing w:after="60"/>
-        <w:ind w:left="360" w:hanging="259"/>
-      </w:pPr>
-      <w:r>
-        <w:rPr>
-          <w:rFonts w:ascii="Arial" w:hAnsi="Arial"/>
-          <w:sz w:val="21"/>
-        </w:rPr>
-        <w:t>•  C5. Detección de cachés con has() y limpieza dinámica por mensaje.</w:t>
-      </w:r>
-    </w:p>
-    <w:p>
-      <w:pPr>
-        <w:spacing w:after="60"/>
-        <w:ind w:left="360" w:hanging="259"/>
-      </w:pPr>
-      <w:r>
-        <w:rPr>
-          <w:rFonts w:ascii="Arial" w:hAnsi="Arial"/>
-          <w:sz w:val="21"/>
-        </w:rPr>
-        <w:t>•  C6. Exclusión de respuestas parciales 206 y solicitudes Range.</w:t>
-      </w:r>
+        <w:t>Para que cada afirmación pueda comprobarse, las características se numeran y se relacionan directamente con una evidencia del código en la sección 6.</w:t>
+      </w:r>
+    </w:p>
+    <w:tbl>
+      <w:tblPr>
+        <w:tblW w:type="auto" w:w="0"/>
+        <w:tblLayout w:type="fixed"/>
+        <w:tblLook w:firstColumn="1" w:firstRow="1" w:lastColumn="0" w:lastRow="0" w:noHBand="0" w:noVBand="1" w:val="04A0"/>
+        <w:tblBorders>
+          <w:top w:val="single" w:sz="4" w:color="B8C7C2"/>
+          <w:left w:val="single" w:sz="4" w:color="B8C7C2"/>
+          <w:bottom w:val="single" w:sz="4" w:color="B8C7C2"/>
+          <w:right w:val="single" w:sz="4" w:color="B8C7C2"/>
+          <w:insideH w:val="single" w:sz="4" w:color="B8C7C2"/>
+          <w:insideV w:val="single" w:sz="4" w:color="B8C7C2"/>
+        </w:tblBorders>
+      </w:tblPr>
+      <w:tblGrid>
+        <w:gridCol w:w="2946"/>
+        <w:gridCol w:w="2946"/>
+        <w:gridCol w:w="2946"/>
+      </w:tblGrid>
+      <w:tr>
+        <w:trPr>
+          <w:tblHeader w:val="true"/>
+        </w:trPr>
+        <w:tc>
+          <w:tcPr>
+            <w:tcW w:type="dxa" w:w="1152"/>
+            <w:vAlign w:val="center"/>
+            <w:shd w:fill="0D3B2E"/>
+          </w:tcPr>
+          <w:p>
+            <w:pPr>
+              <w:spacing w:after="0" w:line="240" w:lineRule="auto"/>
+              <w:jc w:val="left"/>
+            </w:pPr>
+            <w:r/>
+            <w:r>
+              <w:rPr>
+                <w:rFonts w:ascii="Arial" w:hAnsi="Arial"/>
+                <w:b/>
+                <w:color w:val="FFFFFF"/>
+                <w:sz w:val="18"/>
+              </w:rPr>
+              <w:t>Característica</w:t>
+            </w:r>
+          </w:p>
+        </w:tc>
+        <w:tc>
+          <w:tcPr>
+            <w:tcW w:type="dxa" w:w="4968"/>
+            <w:vAlign w:val="center"/>
+            <w:shd w:fill="0D3B2E"/>
+          </w:tcPr>
+          <w:p>
+            <w:pPr>
+              <w:spacing w:after="0" w:line="240" w:lineRule="auto"/>
+              <w:jc w:val="left"/>
+            </w:pPr>
+            <w:r/>
+            <w:r>
+              <w:rPr>
+                <w:rFonts w:ascii="Arial" w:hAnsi="Arial"/>
+                <w:b/>
+                <w:color w:val="FFFFFF"/>
+                <w:sz w:val="18"/>
+              </w:rPr>
+              <w:t>Descripción verificable</w:t>
+            </w:r>
+          </w:p>
+        </w:tc>
+        <w:tc>
+          <w:tcPr>
+            <w:tcW w:type="dxa" w:w="2520"/>
+            <w:vAlign w:val="center"/>
+            <w:shd w:fill="0D3B2E"/>
+          </w:tcPr>
+          <w:p>
+            <w:pPr>
+              <w:spacing w:after="0" w:line="240" w:lineRule="auto"/>
+              <w:jc w:val="left"/>
+            </w:pPr>
+            <w:r/>
+            <w:r>
+              <w:rPr>
+                <w:rFonts w:ascii="Arial" w:hAnsi="Arial"/>
+                <w:b/>
+                <w:color w:val="FFFFFF"/>
+                <w:sz w:val="18"/>
+              </w:rPr>
+              <w:t>Evidencia</w:t>
+            </w:r>
+          </w:p>
+        </w:tc>
+      </w:tr>
+      <w:tr>
+        <w:tc>
+          <w:tcPr>
+            <w:tcW w:type="dxa" w:w="1152"/>
+            <w:vAlign w:val="center"/>
+            <w:shd w:fill="FFFFFF"/>
+          </w:tcPr>
+          <w:p>
+            <w:pPr>
+              <w:spacing w:after="0" w:line="240" w:lineRule="auto"/>
+              <w:jc w:val="left"/>
+            </w:pPr>
+            <w:r/>
+            <w:r>
+              <w:rPr>
+                <w:rFonts w:ascii="Arial" w:hAnsi="Arial"/>
+                <w:b w:val="0"/>
+                <w:color w:val="000000"/>
+                <w:sz w:val="16"/>
+              </w:rPr>
+              <w:t>C1</w:t>
+            </w:r>
+          </w:p>
+        </w:tc>
+        <w:tc>
+          <w:tcPr>
+            <w:tcW w:type="dxa" w:w="4968"/>
+            <w:vAlign w:val="center"/>
+            <w:shd w:fill="FFFFFF"/>
+          </w:tcPr>
+          <w:p>
+            <w:pPr>
+              <w:spacing w:after="0" w:line="240" w:lineRule="auto"/>
+              <w:jc w:val="left"/>
+            </w:pPr>
+            <w:r/>
+            <w:r>
+              <w:rPr>
+                <w:rFonts w:ascii="Arial" w:hAnsi="Arial"/>
+                <w:b w:val="0"/>
+                <w:color w:val="000000"/>
+                <w:sz w:val="16"/>
+              </w:rPr>
+              <w:t>Organización en cachés shell y runtime versionadas.</w:t>
+            </w:r>
+          </w:p>
+        </w:tc>
+        <w:tc>
+          <w:tcPr>
+            <w:tcW w:type="dxa" w:w="2520"/>
+            <w:vAlign w:val="center"/>
+            <w:shd w:fill="FFFFFF"/>
+          </w:tcPr>
+          <w:p>
+            <w:pPr>
+              <w:spacing w:after="0" w:line="240" w:lineRule="auto"/>
+              <w:jc w:val="left"/>
+            </w:pPr>
+            <w:r/>
+            <w:r>
+              <w:rPr>
+                <w:rFonts w:ascii="Arial" w:hAnsi="Arial"/>
+                <w:b w:val="0"/>
+                <w:color w:val="000000"/>
+                <w:sz w:val="16"/>
+              </w:rPr>
+              <w:t>Evidencia 1, página 8</w:t>
+            </w:r>
+          </w:p>
+        </w:tc>
+      </w:tr>
+      <w:tr>
+        <w:tc>
+          <w:tcPr>
+            <w:tcW w:type="dxa" w:w="1152"/>
+            <w:vAlign w:val="center"/>
+            <w:shd w:fill="F2F4F3"/>
+          </w:tcPr>
+          <w:p>
+            <w:pPr>
+              <w:spacing w:after="0" w:line="240" w:lineRule="auto"/>
+              <w:jc w:val="left"/>
+            </w:pPr>
+            <w:r/>
+            <w:r>
+              <w:rPr>
+                <w:rFonts w:ascii="Arial" w:hAnsi="Arial"/>
+                <w:b w:val="0"/>
+                <w:color w:val="000000"/>
+                <w:sz w:val="16"/>
+              </w:rPr>
+              <w:t>C2</w:t>
+            </w:r>
+          </w:p>
+        </w:tc>
+        <w:tc>
+          <w:tcPr>
+            <w:tcW w:type="dxa" w:w="4968"/>
+            <w:vAlign w:val="center"/>
+            <w:shd w:fill="F2F4F3"/>
+          </w:tcPr>
+          <w:p>
+            <w:pPr>
+              <w:spacing w:after="0" w:line="240" w:lineRule="auto"/>
+              <w:jc w:val="left"/>
+            </w:pPr>
+            <w:r/>
+            <w:r>
+              <w:rPr>
+                <w:rFonts w:ascii="Arial" w:hAnsi="Arial"/>
+                <w:b w:val="0"/>
+                <w:color w:val="000000"/>
+                <w:sz w:val="16"/>
+              </w:rPr>
+              <w:t>Precaché individual y múltiple con add() y addAll().</w:t>
+            </w:r>
+          </w:p>
+        </w:tc>
+        <w:tc>
+          <w:tcPr>
+            <w:tcW w:type="dxa" w:w="2520"/>
+            <w:vAlign w:val="center"/>
+            <w:shd w:fill="F2F4F3"/>
+          </w:tcPr>
+          <w:p>
+            <w:pPr>
+              <w:spacing w:after="0" w:line="240" w:lineRule="auto"/>
+              <w:jc w:val="left"/>
+            </w:pPr>
+            <w:r/>
+            <w:r>
+              <w:rPr>
+                <w:rFonts w:ascii="Arial" w:hAnsi="Arial"/>
+                <w:b w:val="0"/>
+                <w:color w:val="000000"/>
+                <w:sz w:val="16"/>
+              </w:rPr>
+              <w:t>Evidencia 2, página 9</w:t>
+            </w:r>
+          </w:p>
+        </w:tc>
+      </w:tr>
+      <w:tr>
+        <w:tc>
+          <w:tcPr>
+            <w:tcW w:type="dxa" w:w="1152"/>
+            <w:vAlign w:val="center"/>
+            <w:shd w:fill="FFFFFF"/>
+          </w:tcPr>
+          <w:p>
+            <w:pPr>
+              <w:spacing w:after="0" w:line="240" w:lineRule="auto"/>
+              <w:jc w:val="left"/>
+            </w:pPr>
+            <w:r/>
+            <w:r>
+              <w:rPr>
+                <w:rFonts w:ascii="Arial" w:hAnsi="Arial"/>
+                <w:b w:val="0"/>
+                <w:color w:val="000000"/>
+                <w:sz w:val="16"/>
+              </w:rPr>
+              <w:t>C3</w:t>
+            </w:r>
+          </w:p>
+        </w:tc>
+        <w:tc>
+          <w:tcPr>
+            <w:tcW w:type="dxa" w:w="4968"/>
+            <w:vAlign w:val="center"/>
+            <w:shd w:fill="FFFFFF"/>
+          </w:tcPr>
+          <w:p>
+            <w:pPr>
+              <w:spacing w:after="0" w:line="240" w:lineRule="auto"/>
+              <w:jc w:val="left"/>
+            </w:pPr>
+            <w:r/>
+            <w:r>
+              <w:rPr>
+                <w:rFonts w:ascii="Arial" w:hAnsi="Arial"/>
+                <w:b w:val="0"/>
+                <w:color w:val="000000"/>
+                <w:sz w:val="16"/>
+              </w:rPr>
+              <w:t>Límite de 40 entradas mediante keys() y delete().</w:t>
+            </w:r>
+          </w:p>
+        </w:tc>
+        <w:tc>
+          <w:tcPr>
+            <w:tcW w:type="dxa" w:w="2520"/>
+            <w:vAlign w:val="center"/>
+            <w:shd w:fill="FFFFFF"/>
+          </w:tcPr>
+          <w:p>
+            <w:pPr>
+              <w:spacing w:after="0" w:line="240" w:lineRule="auto"/>
+              <w:jc w:val="left"/>
+            </w:pPr>
+            <w:r/>
+            <w:r>
+              <w:rPr>
+                <w:rFonts w:ascii="Arial" w:hAnsi="Arial"/>
+                <w:b w:val="0"/>
+                <w:color w:val="000000"/>
+                <w:sz w:val="16"/>
+              </w:rPr>
+              <w:t>Evidencia 3, página 10</w:t>
+            </w:r>
+          </w:p>
+        </w:tc>
+      </w:tr>
+      <w:tr>
+        <w:tc>
+          <w:tcPr>
+            <w:tcW w:type="dxa" w:w="1152"/>
+            <w:vAlign w:val="center"/>
+            <w:shd w:fill="F2F4F3"/>
+          </w:tcPr>
+          <w:p>
+            <w:pPr>
+              <w:spacing w:after="0" w:line="240" w:lineRule="auto"/>
+              <w:jc w:val="left"/>
+            </w:pPr>
+            <w:r/>
+            <w:r>
+              <w:rPr>
+                <w:rFonts w:ascii="Arial" w:hAnsi="Arial"/>
+                <w:b w:val="0"/>
+                <w:color w:val="000000"/>
+                <w:sz w:val="16"/>
+              </w:rPr>
+              <w:t>C4</w:t>
+            </w:r>
+          </w:p>
+        </w:tc>
+        <w:tc>
+          <w:tcPr>
+            <w:tcW w:type="dxa" w:w="4968"/>
+            <w:vAlign w:val="center"/>
+            <w:shd w:fill="F2F4F3"/>
+          </w:tcPr>
+          <w:p>
+            <w:pPr>
+              <w:spacing w:after="0" w:line="240" w:lineRule="auto"/>
+              <w:jc w:val="left"/>
+            </w:pPr>
+            <w:r/>
+            <w:r>
+              <w:rPr>
+                <w:rFonts w:ascii="Arial" w:hAnsi="Arial"/>
+                <w:b w:val="0"/>
+                <w:color w:val="000000"/>
+                <w:sz w:val="16"/>
+              </w:rPr>
+              <w:t>Estrategias Network First y Cache First.</w:t>
+            </w:r>
+          </w:p>
+        </w:tc>
+        <w:tc>
+          <w:tcPr>
+            <w:tcW w:type="dxa" w:w="2520"/>
+            <w:vAlign w:val="center"/>
+            <w:shd w:fill="F2F4F3"/>
+          </w:tcPr>
+          <w:p>
+            <w:pPr>
+              <w:spacing w:after="0" w:line="240" w:lineRule="auto"/>
+              <w:jc w:val="left"/>
+            </w:pPr>
+            <w:r/>
+            <w:r>
+              <w:rPr>
+                <w:rFonts w:ascii="Arial" w:hAnsi="Arial"/>
+                <w:b w:val="0"/>
+                <w:color w:val="000000"/>
+                <w:sz w:val="16"/>
+              </w:rPr>
+              <w:t>Evidencia 4, página 11</w:t>
+            </w:r>
+          </w:p>
+        </w:tc>
+      </w:tr>
+      <w:tr>
+        <w:tc>
+          <w:tcPr>
+            <w:tcW w:type="dxa" w:w="1152"/>
+            <w:vAlign w:val="center"/>
+            <w:shd w:fill="FFFFFF"/>
+          </w:tcPr>
+          <w:p>
+            <w:pPr>
+              <w:spacing w:after="0" w:line="240" w:lineRule="auto"/>
+              <w:jc w:val="left"/>
+            </w:pPr>
+            <w:r/>
+            <w:r>
+              <w:rPr>
+                <w:rFonts w:ascii="Arial" w:hAnsi="Arial"/>
+                <w:b w:val="0"/>
+                <w:color w:val="000000"/>
+                <w:sz w:val="16"/>
+              </w:rPr>
+              <w:t>C5</w:t>
+            </w:r>
+          </w:p>
+        </w:tc>
+        <w:tc>
+          <w:tcPr>
+            <w:tcW w:type="dxa" w:w="4968"/>
+            <w:vAlign w:val="center"/>
+            <w:shd w:fill="FFFFFF"/>
+          </w:tcPr>
+          <w:p>
+            <w:pPr>
+              <w:spacing w:after="0" w:line="240" w:lineRule="auto"/>
+              <w:jc w:val="left"/>
+            </w:pPr>
+            <w:r/>
+            <w:r>
+              <w:rPr>
+                <w:rFonts w:ascii="Arial" w:hAnsi="Arial"/>
+                <w:b w:val="0"/>
+                <w:color w:val="000000"/>
+                <w:sz w:val="16"/>
+              </w:rPr>
+              <w:t>Diagnóstico con has() y limpieza por mensaje.</w:t>
+            </w:r>
+          </w:p>
+        </w:tc>
+        <w:tc>
+          <w:tcPr>
+            <w:tcW w:type="dxa" w:w="2520"/>
+            <w:vAlign w:val="center"/>
+            <w:shd w:fill="FFFFFF"/>
+          </w:tcPr>
+          <w:p>
+            <w:pPr>
+              <w:spacing w:after="0" w:line="240" w:lineRule="auto"/>
+              <w:jc w:val="left"/>
+            </w:pPr>
+            <w:r/>
+            <w:r>
+              <w:rPr>
+                <w:rFonts w:ascii="Arial" w:hAnsi="Arial"/>
+                <w:b w:val="0"/>
+                <w:color w:val="000000"/>
+                <w:sz w:val="16"/>
+              </w:rPr>
+              <w:t>Evidencia 5, página 13</w:t>
+            </w:r>
+          </w:p>
+        </w:tc>
+      </w:tr>
+      <w:tr>
+        <w:tc>
+          <w:tcPr>
+            <w:tcW w:type="dxa" w:w="1152"/>
+            <w:vAlign w:val="center"/>
+            <w:shd w:fill="F2F4F3"/>
+          </w:tcPr>
+          <w:p>
+            <w:pPr>
+              <w:spacing w:after="0" w:line="240" w:lineRule="auto"/>
+              <w:jc w:val="left"/>
+            </w:pPr>
+            <w:r/>
+            <w:r>
+              <w:rPr>
+                <w:rFonts w:ascii="Arial" w:hAnsi="Arial"/>
+                <w:b w:val="0"/>
+                <w:color w:val="000000"/>
+                <w:sz w:val="16"/>
+              </w:rPr>
+              <w:t>C6</w:t>
+            </w:r>
+          </w:p>
+        </w:tc>
+        <w:tc>
+          <w:tcPr>
+            <w:tcW w:type="dxa" w:w="4968"/>
+            <w:vAlign w:val="center"/>
+            <w:shd w:fill="F2F4F3"/>
+          </w:tcPr>
+          <w:p>
+            <w:pPr>
+              <w:spacing w:after="0" w:line="240" w:lineRule="auto"/>
+              <w:jc w:val="left"/>
+            </w:pPr>
+            <w:r/>
+            <w:r>
+              <w:rPr>
+                <w:rFonts w:ascii="Arial" w:hAnsi="Arial"/>
+                <w:b w:val="0"/>
+                <w:color w:val="000000"/>
+                <w:sz w:val="16"/>
+              </w:rPr>
+              <w:t>Protección ante respuestas 206 y solicitudes Range.</w:t>
+            </w:r>
+          </w:p>
+        </w:tc>
+        <w:tc>
+          <w:tcPr>
+            <w:tcW w:type="dxa" w:w="2520"/>
+            <w:vAlign w:val="center"/>
+            <w:shd w:fill="F2F4F3"/>
+          </w:tcPr>
+          <w:p>
+            <w:pPr>
+              <w:spacing w:after="0" w:line="240" w:lineRule="auto"/>
+              <w:jc w:val="left"/>
+            </w:pPr>
+            <w:r/>
+            <w:r>
+              <w:rPr>
+                <w:rFonts w:ascii="Arial" w:hAnsi="Arial"/>
+                <w:b w:val="0"/>
+                <w:color w:val="000000"/>
+                <w:sz w:val="16"/>
+              </w:rPr>
+              <w:t>Evidencia 6, página 14</w:t>
+            </w:r>
+          </w:p>
+        </w:tc>
+      </w:tr>
+    </w:tbl>
+    <w:p>
+      <w:pPr>
+        <w:spacing w:after="0"/>
+      </w:pPr>
     </w:p>
     <w:p>
       <w:r>
@@ -3389,7 +3935,7 @@
           <w:b/>
           <w:color w:val="000000"/>
         </w:rPr>
-        <w:t>6 Nuevas implementaciones en EcoRuta</w:t>
+        <w:t>6 Evidencias por característica</w:t>
       </w:r>
     </w:p>
     <w:p>
@@ -3404,7 +3950,7 @@
           <w:b/>
           <w:color w:val="000000"/>
         </w:rPr>
-        <w:t>6.1 Configuración, versión y Cache.put()</w:t>
+        <w:t>6.1 Evidencia 1 de la característica 1</w:t>
       </w:r>
     </w:p>
     <w:p>
@@ -3418,7 +3964,7 @@
           <w:color w:val="000000"/>
           <w:sz w:val="21"/>
         </w:rPr>
-        <w:t>Se incorporaron un prefijo, una versión y dos nombres independientes. La función isCacheableResponse() acepta únicamente respuestas completas con status 200 y tipo basic. putInCache() abre el contenedor indicado y usa Cache.put() con una copia de la respuesta.</w:t>
+        <w:t>Característica C1: organización en cachés shell y runtime versionadas. Se incorporaron un prefijo, una versión y dos nombres independientes. La función isCacheableResponse() acepta únicamente respuestas completas con status 200 y tipo basic. putInCache() abre el contenedor indicado y utiliza Cache.put().</w:t>
       </w:r>
     </w:p>
     <w:p>
@@ -3474,7 +4020,7 @@
           <w:color w:val="0D3B2E"/>
           <w:sz w:val="18"/>
         </w:rPr>
-        <w:t>Figura 2. Evidencia C1: cachés shell/runtime versionadas y validación previa a Cache.put().</w:t>
+        <w:t>Figura 2. Evidencia 1 de C1: cachés shell y runtime versionadas.</w:t>
       </w:r>
     </w:p>
     <w:p>
@@ -3494,7 +4040,7 @@
           <w:b/>
           <w:color w:val="000000"/>
         </w:rPr>
-        <w:t>6.2 Cache.keys() y Cache.delete()</w:t>
+        <w:t>6.2 Evidencia 2 de la característica 2</w:t>
       </w:r>
     </w:p>
     <w:p>
@@ -3508,7 +4054,111 @@
           <w:color w:val="000000"/>
           <w:sz w:val="21"/>
         </w:rPr>
-        <w:t>trimCache() constituye una implementación nueva. Primero abre la caché dinámica, después obtiene todas las solicitudes mediante Cache.keys(), calcula cuántas exceden el límite y elimina las entradas más antiguas con Cache.delete().</w:t>
+        <w:t>Característica C2: precaché individual y múltiple. Durante install, Cache.add() incorpora offline.html y Cache.addAll() agrega el conjunto APP_SHELL. Así se documentan ambos métodos con un propósito funcional.</w:t>
+      </w:r>
+    </w:p>
+    <w:p>
+      <w:pPr>
+        <w:spacing w:after="0"/>
+        <w:jc w:val="center"/>
+      </w:pPr>
+      <w:r>
+        <w:drawing>
+          <wp:inline xmlns:a="http://schemas.openxmlformats.org/drawingml/2006/main" xmlns:pic="http://schemas.openxmlformats.org/drawingml/2006/picture">
+            <wp:extent cx="5623560" cy="2057039"/>
+            <wp:docPr id="4" name="Picture 4"/>
+            <wp:cNvGraphicFramePr>
+              <a:graphicFrameLocks noChangeAspect="1"/>
+            </wp:cNvGraphicFramePr>
+            <a:graphic>
+              <a:graphicData uri="http://schemas.openxmlformats.org/drawingml/2006/picture">
+                <pic:pic>
+                  <pic:nvPicPr>
+                    <pic:cNvPr id="0" name="05-cache-add-addall.png"/>
+                    <pic:cNvPicPr/>
+                  </pic:nvPicPr>
+                  <pic:blipFill>
+                    <a:blip r:embed="rId28"/>
+                    <a:stretch>
+                      <a:fillRect/>
+                    </a:stretch>
+                  </pic:blipFill>
+                  <pic:spPr>
+                    <a:xfrm>
+                      <a:off x="0" y="0"/>
+                      <a:ext cx="5623560" cy="2057039"/>
+                    </a:xfrm>
+                    <a:prstGeom prst="rect"/>
+                  </pic:spPr>
+                </pic:pic>
+              </a:graphicData>
+            </a:graphic>
+          </wp:inline>
+        </w:drawing>
+      </w:r>
+    </w:p>
+    <w:p>
+      <w:pPr>
+        <w:spacing w:before="80" w:after="140"/>
+        <w:jc w:val="center"/>
+      </w:pPr>
+      <w:r>
+        <w:rPr>
+          <w:rFonts w:ascii="Arial" w:hAnsi="Arial"/>
+          <w:b/>
+          <w:i/>
+          <w:color w:val="0D3B2E"/>
+          <w:sz w:val="18"/>
+        </w:rPr>
+        <w:t>Figura 3. Evidencia 2 de C2: implementación de Cache.add() y Cache.addAll().</w:t>
+      </w:r>
+    </w:p>
+    <w:p>
+      <w:pPr>
+        <w:spacing w:after="140" w:line="269" w:lineRule="auto"/>
+        <w:jc w:val="both"/>
+      </w:pPr>
+      <w:r>
+        <w:rPr>
+          <w:rFonts w:ascii="Arial" w:hAnsi="Arial"/>
+          <w:color w:val="000000"/>
+          <w:sz w:val="21"/>
+        </w:rPr>
+        <w:t>event.waitUntil() conserva activa la instalación hasta concluir el almacenamiento y skipWaiting() permite avanzar a la activación.</w:t>
+      </w:r>
+    </w:p>
+    <w:p>
+      <w:r>
+        <w:br w:type="page"/>
+      </w:r>
+    </w:p>
+    <w:p>
+      <w:pPr>
+        <w:pStyle w:val="Ttulo2"/>
+        <w:keepNext/>
+        <w:spacing w:before="40" w:after="140"/>
+      </w:pPr>
+      <w:r>
+        <w:rPr>
+          <w:rFonts w:ascii="Arial" w:hAnsi="Arial"/>
+          <w:b/>
+          <w:color w:val="000000"/>
+        </w:rPr>
+        <w:t>6.3 Evidencia 3 de la característica 3</w:t>
+      </w:r>
+    </w:p>
+    <w:p>
+      <w:pPr>
+        <w:spacing w:after="140" w:line="269" w:lineRule="auto"/>
+        <w:jc w:val="both"/>
+      </w:pPr>
+      <w:r>
+        <w:rPr>
+          <w:rFonts w:ascii="Arial" w:hAnsi="Arial"/>
+          <w:color w:val="000000"/>
+          <w:sz w:val="21"/>
+        </w:rPr>
+        <w:t>Característica C3: control del crecimiento de la caché dinámica. trimCache() obtiene las solicitudes mediante Cache.keys(), calcula cuántas exceden el límite de 40 y elimina las más antiguas con Cache.delete().</w:t>
       </w:r>
     </w:p>
     <w:p>
@@ -3520,7 +4170,7 @@
         <w:drawing>
           <wp:inline xmlns:a="http://schemas.openxmlformats.org/drawingml/2006/main" xmlns:pic="http://schemas.openxmlformats.org/drawingml/2006/picture">
             <wp:extent cx="5623560" cy="1746263"/>
-            <wp:docPr id="4" name="Picture 4"/>
+            <wp:docPr id="5" name="Picture 5"/>
             <wp:cNvGraphicFramePr>
               <a:graphicFrameLocks noChangeAspect="1"/>
             </wp:cNvGraphicFramePr>
@@ -3532,7 +4182,7 @@
                     <pic:cNvPicPr/>
                   </pic:nvPicPr>
                   <pic:blipFill>
-                    <a:blip r:embed="rId28"/>
+                    <a:blip r:embed="rId29"/>
                     <a:stretch>
                       <a:fillRect/>
                     </a:stretch>
@@ -3564,7 +4214,7 @@
           <w:color w:val="0D3B2E"/>
           <w:sz w:val="18"/>
         </w:rPr>
-        <w:t>Figura 3. Evidencia C3: enumeración y eliminación de entradas para limitar la caché dinámica.</w:t>
+        <w:t>Figura 4. Evidencia 3 de C3: enumeración y eliminación de entradas dinámicas.</w:t>
       </w:r>
     </w:p>
     <w:p>
@@ -3578,7 +4228,7 @@
           <w:color w:val="000000"/>
           <w:sz w:val="21"/>
         </w:rPr>
-        <w:t>El valor MAX_RUNTIME_ENTRIES = 40 evita que el almacenamiento crezca sin control. Si la cantidad no supera el límite, la función termina sin eliminar información.</w:t>
+        <w:t>Si la cantidad no supera MAX_RUNTIME_ENTRIES, la función finaliza sin eliminar información.</w:t>
       </w:r>
     </w:p>
     <w:p>
@@ -3598,7 +4248,7 @@
           <w:b/>
           <w:color w:val="000000"/>
         </w:rPr>
-        <w:t>6.3 Estrategias Network First y Cache First</w:t>
+        <w:t>6.4 Evidencia 4 de la característica 4</w:t>
       </w:r>
     </w:p>
     <w:p>
@@ -3612,7 +4262,7 @@
           <w:color w:val="000000"/>
           <w:sz w:val="21"/>
         </w:rPr>
-        <w:t>Network First se usa para documentos HTML: intenta obtener una versión actualizada y, si la red falla, busca la solicitud en caché o muestra offline.html. Cache First se utiliza en archivos estáticos: consulta primero runtime-v2, después el resto de cachés y finalmente la red.</w:t>
+        <w:t>Característica C4: estrategias diferenciadas. Network First intenta obtener primero una versión actual de los documentos HTML y utiliza caché u offline.html cuando falla la red. Cache First prioriza los recursos estáticos guardados.</w:t>
       </w:r>
     </w:p>
     <w:p>
@@ -3624,7 +4274,7 @@
         <w:drawing>
           <wp:inline xmlns:a="http://schemas.openxmlformats.org/drawingml/2006/main" xmlns:pic="http://schemas.openxmlformats.org/drawingml/2006/picture">
             <wp:extent cx="5349240" cy="4420161"/>
-            <wp:docPr id="5" name="Picture 5"/>
+            <wp:docPr id="6" name="Picture 6"/>
             <wp:cNvGraphicFramePr>
               <a:graphicFrameLocks noChangeAspect="1"/>
             </wp:cNvGraphicFramePr>
@@ -3636,7 +4286,7 @@
                     <pic:cNvPicPr/>
                   </pic:nvPicPr>
                   <pic:blipFill>
-                    <a:blip r:embed="rId29"/>
+                    <a:blip r:embed="rId30"/>
                     <a:stretch>
                       <a:fillRect/>
                     </a:stretch>
@@ -3668,7 +4318,7 @@
           <w:color w:val="0D3B2E"/>
           <w:sz w:val="18"/>
         </w:rPr>
-        <w:t>Figura 4. Evidencia C4: estrategias diferenciadas para navegación y recursos estáticos.</w:t>
+        <w:t>Figura 5. Evidencia 4 de C4: estrategias Network First y Cache First.</w:t>
       </w:r>
     </w:p>
     <w:p>
@@ -3688,7 +4338,7 @@
           <w:b/>
           <w:color w:val="000000"/>
         </w:rPr>
-        <w:t>6.4 Cache.add() y Cache.addAll()</w:t>
+        <w:t>6.5 Evidencia complementaria de mantenimiento</w:t>
       </w:r>
     </w:p>
     <w:p>
@@ -3702,111 +4352,7 @@
           <w:color w:val="000000"/>
           <w:sz w:val="21"/>
         </w:rPr>
-        <w:t>Durante install se abren los recursos del shell. Cache.add() incorpora de forma individual la nueva pantalla offline.html, mientras Cache.addAll() agrega el conjunto APP_SHELL. Esta separación permite demostrar ambos métodos con un propósito funcional.</w:t>
-      </w:r>
-    </w:p>
-    <w:p>
-      <w:pPr>
-        <w:spacing w:after="0"/>
-        <w:jc w:val="center"/>
-      </w:pPr>
-      <w:r>
-        <w:drawing>
-          <wp:inline xmlns:a="http://schemas.openxmlformats.org/drawingml/2006/main" xmlns:pic="http://schemas.openxmlformats.org/drawingml/2006/picture">
-            <wp:extent cx="5623560" cy="2057039"/>
-            <wp:docPr id="6" name="Picture 6"/>
-            <wp:cNvGraphicFramePr>
-              <a:graphicFrameLocks noChangeAspect="1"/>
-            </wp:cNvGraphicFramePr>
-            <a:graphic>
-              <a:graphicData uri="http://schemas.openxmlformats.org/drawingml/2006/picture">
-                <pic:pic>
-                  <pic:nvPicPr>
-                    <pic:cNvPr id="0" name="05-cache-add-addall.png"/>
-                    <pic:cNvPicPr/>
-                  </pic:nvPicPr>
-                  <pic:blipFill>
-                    <a:blip r:embed="rId30"/>
-                    <a:stretch>
-                      <a:fillRect/>
-                    </a:stretch>
-                  </pic:blipFill>
-                  <pic:spPr>
-                    <a:xfrm>
-                      <a:off x="0" y="0"/>
-                      <a:ext cx="5623560" cy="2057039"/>
-                    </a:xfrm>
-                    <a:prstGeom prst="rect"/>
-                  </pic:spPr>
-                </pic:pic>
-              </a:graphicData>
-            </a:graphic>
-          </wp:inline>
-        </w:drawing>
-      </w:r>
-    </w:p>
-    <w:p>
-      <w:pPr>
-        <w:spacing w:before="80" w:after="140"/>
-        <w:jc w:val="center"/>
-      </w:pPr>
-      <w:r>
-        <w:rPr>
-          <w:rFonts w:ascii="Arial" w:hAnsi="Arial"/>
-          <w:b/>
-          <w:i/>
-          <w:color w:val="0D3B2E"/>
-          <w:sz w:val="18"/>
-        </w:rPr>
-        <w:t>Figura 5. Evidencia C2: implementación nueva de Cache.add() y conservación de Cache.addAll().</w:t>
-      </w:r>
-    </w:p>
-    <w:p>
-      <w:pPr>
-        <w:spacing w:after="140" w:line="269" w:lineRule="auto"/>
-        <w:jc w:val="both"/>
-      </w:pPr>
-      <w:r>
-        <w:rPr>
-          <w:rFonts w:ascii="Arial" w:hAnsi="Arial"/>
-          <w:color w:val="000000"/>
-          <w:sz w:val="21"/>
-        </w:rPr>
-        <w:t>event.waitUntil() mantiene activa la instalación hasta que las operaciones terminan. Después, skipWaiting() permite que la versión nueva avance al estado de activación.</w:t>
-      </w:r>
-    </w:p>
-    <w:p>
-      <w:r>
-        <w:br w:type="page"/>
-      </w:r>
-    </w:p>
-    <w:p>
-      <w:pPr>
-        <w:pStyle w:val="Ttulo2"/>
-        <w:keepNext/>
-        <w:spacing w:before="40" w:after="140"/>
-      </w:pPr>
-      <w:r>
-        <w:rPr>
-          <w:rFonts w:ascii="Arial" w:hAnsi="Arial"/>
-          <w:b/>
-          <w:color w:val="000000"/>
-        </w:rPr>
-        <w:t>6.5 CacheStorage.keys() y CacheStorage.delete()</w:t>
-      </w:r>
-    </w:p>
-    <w:p>
-      <w:pPr>
-        <w:spacing w:after="140" w:line="269" w:lineRule="auto"/>
-        <w:jc w:val="both"/>
-      </w:pPr>
-      <w:r>
-        <w:rPr>
-          <w:rFonts w:ascii="Arial" w:hAnsi="Arial"/>
-          <w:color w:val="000000"/>
-          <w:sz w:val="21"/>
-        </w:rPr>
-        <w:t>El evento activate construye una lista de las cachés vigentes, obtiene todos los nombres con CacheStorage.keys() y elimina únicamente las versiones antiguas cuyo nombre comienza con el prefijo ecoruta. De esta forma no afecta cachés de otras aplicaciones del mismo origen.</w:t>
+        <w:t>El evento activate respalda el mantenimiento general de la API Cache. Construye una lista de cachés vigentes, consulta todos los nombres con CacheStorage.keys() y elimina únicamente las versiones antiguas de EcoRuta mediante CacheStorage.delete().</w:t>
       </w:r>
     </w:p>
     <w:p>
@@ -3862,7 +4408,7 @@
           <w:color w:val="0D3B2E"/>
           <w:sz w:val="18"/>
         </w:rPr>
-        <w:t>Figura 6. Limpieza segura de versiones anteriores mediante keys() y delete().</w:t>
+        <w:t>Figura 6. Evidencia complementaria: limpieza segura de versiones anteriores.</w:t>
       </w:r>
     </w:p>
     <w:p>
@@ -3882,7 +4428,7 @@
           <w:b/>
           <w:color w:val="000000"/>
         </w:rPr>
-        <w:t>6.6 Control de solicitudes Range y respuestas 206</w:t>
+        <w:t>6.6 Evidencia 5 de la característica 5</w:t>
       </w:r>
     </w:p>
     <w:p>
@@ -3896,7 +4442,111 @@
           <w:color w:val="000000"/>
           <w:sz w:val="21"/>
         </w:rPr>
-        <w:t>Las solicitudes de video pueden incluir la cabecera Range y producir respuestas parciales con estado 206. Debido a que Cache.put() no admite estas respuestas, el evento fetch las deja bajo control directo del navegador. Para el resto, solo se almacenan respuestas status 200 validadas por isCacheableResponse().</w:t>
+        <w:t>Característica C5: diagnóstico y limpieza controlada. GET_CACHE_STATUS utiliza CacheStorage.has() para comprobar la existencia de shell-v2 y runtime-v2. CLEAR_RUNTIME_CACHE elimina solo la caché dinámica sin afectar el shell offline.</w:t>
+      </w:r>
+    </w:p>
+    <w:p>
+      <w:pPr>
+        <w:spacing w:after="0"/>
+        <w:jc w:val="center"/>
+      </w:pPr>
+      <w:r>
+        <w:drawing>
+          <wp:inline xmlns:a="http://schemas.openxmlformats.org/drawingml/2006/main" xmlns:pic="http://schemas.openxmlformats.org/drawingml/2006/picture">
+            <wp:extent cx="5623560" cy="2160631"/>
+            <wp:docPr id="8" name="Picture 8"/>
+            <wp:cNvGraphicFramePr>
+              <a:graphicFrameLocks noChangeAspect="1"/>
+            </wp:cNvGraphicFramePr>
+            <a:graphic>
+              <a:graphicData uri="http://schemas.openxmlformats.org/drawingml/2006/picture">
+                <pic:pic>
+                  <pic:nvPicPr>
+                    <pic:cNvPr id="0" name="08-cachestorage-has.png"/>
+                    <pic:cNvPicPr/>
+                  </pic:nvPicPr>
+                  <pic:blipFill>
+                    <a:blip r:embed="rId32"/>
+                    <a:stretch>
+                      <a:fillRect/>
+                    </a:stretch>
+                  </pic:blipFill>
+                  <pic:spPr>
+                    <a:xfrm>
+                      <a:off x="0" y="0"/>
+                      <a:ext cx="5623560" cy="2160631"/>
+                    </a:xfrm>
+                    <a:prstGeom prst="rect"/>
+                  </pic:spPr>
+                </pic:pic>
+              </a:graphicData>
+            </a:graphic>
+          </wp:inline>
+        </w:drawing>
+      </w:r>
+    </w:p>
+    <w:p>
+      <w:pPr>
+        <w:spacing w:before="80" w:after="140"/>
+        <w:jc w:val="center"/>
+      </w:pPr>
+      <w:r>
+        <w:rPr>
+          <w:rFonts w:ascii="Arial" w:hAnsi="Arial"/>
+          <w:b/>
+          <w:i/>
+          <w:color w:val="0D3B2E"/>
+          <w:sz w:val="18"/>
+        </w:rPr>
+        <w:t>Figura 7. Evidencia 5 de C5: has() y eliminación selectiva de runtime.</w:t>
+      </w:r>
+    </w:p>
+    <w:p>
+      <w:pPr>
+        <w:spacing w:after="140" w:line="269" w:lineRule="auto"/>
+        <w:jc w:val="both"/>
+      </w:pPr>
+      <w:r>
+        <w:rPr>
+          <w:rFonts w:ascii="Arial" w:hAnsi="Arial"/>
+          <w:color w:val="000000"/>
+          <w:sz w:val="21"/>
+        </w:rPr>
+        <w:t>Las órdenes se envían mediante navigator.serviceWorker.controller.postMessage(), lo que permite comprobar el comportamiento desde DevTools.</w:t>
+      </w:r>
+    </w:p>
+    <w:p>
+      <w:r>
+        <w:br w:type="page"/>
+      </w:r>
+    </w:p>
+    <w:p>
+      <w:pPr>
+        <w:pStyle w:val="Ttulo2"/>
+        <w:keepNext/>
+        <w:spacing w:before="40" w:after="140"/>
+      </w:pPr>
+      <w:r>
+        <w:rPr>
+          <w:rFonts w:ascii="Arial" w:hAnsi="Arial"/>
+          <w:b/>
+          <w:color w:val="000000"/>
+        </w:rPr>
+        <w:t>6.7 Evidencia 6 de la característica 6</w:t>
+      </w:r>
+    </w:p>
+    <w:p>
+      <w:pPr>
+        <w:spacing w:after="140" w:line="269" w:lineRule="auto"/>
+        <w:jc w:val="both"/>
+      </w:pPr>
+      <w:r>
+        <w:rPr>
+          <w:rFonts w:ascii="Arial" w:hAnsi="Arial"/>
+          <w:color w:val="000000"/>
+          <w:sz w:val="21"/>
+        </w:rPr>
+        <w:t>Característica C6: protección ante respuestas parciales. Las solicitudes de video con cabecera Range pueden producir estado 206. El evento fetch las deja bajo control del navegador y solo almacena respuestas completas status 200.</w:t>
       </w:r>
     </w:p>
     <w:p>
@@ -3908,7 +4558,7 @@
         <w:drawing>
           <wp:inline xmlns:a="http://schemas.openxmlformats.org/drawingml/2006/main" xmlns:pic="http://schemas.openxmlformats.org/drawingml/2006/picture">
             <wp:extent cx="5440680" cy="3493489"/>
-            <wp:docPr id="8" name="Picture 8"/>
+            <wp:docPr id="9" name="Picture 9"/>
             <wp:cNvGraphicFramePr>
               <a:graphicFrameLocks noChangeAspect="1"/>
             </wp:cNvGraphicFramePr>
@@ -3920,7 +4570,7 @@
                     <pic:cNvPicPr/>
                   </pic:nvPicPr>
                   <pic:blipFill>
-                    <a:blip r:embed="rId32"/>
+                    <a:blip r:embed="rId33"/>
                     <a:stretch>
                       <a:fillRect/>
                     </a:stretch>
@@ -3952,111 +4602,7 @@
           <w:color w:val="0D3B2E"/>
           <w:sz w:val="18"/>
         </w:rPr>
-        <w:t>Figura 7. Evidencia C6: exclusión de Range y selección de estrategia dentro de fetch.</w:t>
-      </w:r>
-    </w:p>
-    <w:p>
-      <w:r>
-        <w:br w:type="page"/>
-      </w:r>
-    </w:p>
-    <w:p>
-      <w:pPr>
-        <w:pStyle w:val="Ttulo2"/>
-        <w:keepNext/>
-        <w:spacing w:before="40" w:after="140"/>
-      </w:pPr>
-      <w:r>
-        <w:rPr>
-          <w:rFonts w:ascii="Arial" w:hAnsi="Arial"/>
-          <w:b/>
-          <w:color w:val="000000"/>
-        </w:rPr>
-        <w:t>6.7 CacheStorage.has() y limpieza controlada</w:t>
-      </w:r>
-    </w:p>
-    <w:p>
-      <w:pPr>
-        <w:spacing w:after="140" w:line="269" w:lineRule="auto"/>
-        <w:jc w:val="both"/>
-      </w:pPr>
-      <w:r>
-        <w:rPr>
-          <w:rFonts w:ascii="Arial" w:hAnsi="Arial"/>
-          <w:color w:val="000000"/>
-          <w:sz w:val="21"/>
-        </w:rPr>
-        <w:t>El evento message agrega dos herramientas de diagnóstico. GET_CACHE_STATUS utiliza CacheStorage.has() para comprobar la existencia de shell-v2 y runtime-v2 y devuelve también los nombres disponibles. CLEAR_RUNTIME_CACHE elimina solo la caché dinámica, sin afectar el shell necesario para abrir la aplicación offline.</w:t>
-      </w:r>
-    </w:p>
-    <w:p>
-      <w:pPr>
-        <w:spacing w:after="0"/>
-        <w:jc w:val="center"/>
-      </w:pPr>
-      <w:r>
-        <w:drawing>
-          <wp:inline xmlns:a="http://schemas.openxmlformats.org/drawingml/2006/main" xmlns:pic="http://schemas.openxmlformats.org/drawingml/2006/picture">
-            <wp:extent cx="5623560" cy="2160631"/>
-            <wp:docPr id="9" name="Picture 9"/>
-            <wp:cNvGraphicFramePr>
-              <a:graphicFrameLocks noChangeAspect="1"/>
-            </wp:cNvGraphicFramePr>
-            <a:graphic>
-              <a:graphicData uri="http://schemas.openxmlformats.org/drawingml/2006/picture">
-                <pic:pic>
-                  <pic:nvPicPr>
-                    <pic:cNvPr id="0" name="08-cachestorage-has.png"/>
-                    <pic:cNvPicPr/>
-                  </pic:nvPicPr>
-                  <pic:blipFill>
-                    <a:blip r:embed="rId33"/>
-                    <a:stretch>
-                      <a:fillRect/>
-                    </a:stretch>
-                  </pic:blipFill>
-                  <pic:spPr>
-                    <a:xfrm>
-                      <a:off x="0" y="0"/>
-                      <a:ext cx="5623560" cy="2160631"/>
-                    </a:xfrm>
-                    <a:prstGeom prst="rect"/>
-                  </pic:spPr>
-                </pic:pic>
-              </a:graphicData>
-            </a:graphic>
-          </wp:inline>
-        </w:drawing>
-      </w:r>
-    </w:p>
-    <w:p>
-      <w:pPr>
-        <w:spacing w:before="80" w:after="140"/>
-        <w:jc w:val="center"/>
-      </w:pPr>
-      <w:r>
-        <w:rPr>
-          <w:rFonts w:ascii="Arial" w:hAnsi="Arial"/>
-          <w:b/>
-          <w:i/>
-          <w:color w:val="0D3B2E"/>
-          <w:sz w:val="18"/>
-        </w:rPr>
-        <w:t>Figura 8. Evidencia C5: consulta de existencia con has() y eliminación selectiva de runtime.</w:t>
-      </w:r>
-    </w:p>
-    <w:p>
-      <w:pPr>
-        <w:spacing w:after="140" w:line="269" w:lineRule="auto"/>
-        <w:jc w:val="both"/>
-      </w:pPr>
-      <w:r>
-        <w:rPr>
-          <w:rFonts w:ascii="Arial" w:hAnsi="Arial"/>
-          <w:color w:val="000000"/>
-          <w:sz w:val="21"/>
-        </w:rPr>
-        <w:t>Estas órdenes pueden enviarse desde DevTools mediante navigator.serviceWorker.controller.postMessage(), lo que facilita demostrar el comportamiento sin modificar la interfaz visual de EcoRuta.</w:t>
+        <w:t>Figura 8. Evidencia 6 de C6: exclusión de Range y prevención del error 206.</w:t>
       </w:r>
     </w:p>
     <w:p>

</xml_diff>